<commit_message>
feat(search): Phase 5 Search 구현
Backend: knowledge_nodes.search_vector(제목 A, 요약·본문 C, 본문 앞 100,000자) + 제목 trigram GIN (V8),
GET /search (FTS + trigram, Snippet 현재 버전 코드, 태그/언어 일치), score_key 기반 cursor,
구조화 highlight와 발췌, 0건 fallback, 검색어를 남기지 않는 지표.
랭킹: 정확 제목 일치를 300으로 상향(약한 일치의 합에 밀리지 않도록), 제목 부분 일치 추가, 최신성은 일 단위 계단식.
Frontend: 전역 검색창(/, Ctrl+K), 결과 페이지(하이라이트, 일치 필드, 키보드 탐색, URL 필터, 더 보기, 0건 안내),
2자 미만/자모 입력은 서버 호출 없이 최근 항목.
Tests: 랭킹 fixture(대표 20개 query), 한국어/코드/악성 입력/격리/cursor/플랜 검증, Playwright E2E.
Docs: 설계서 v1.8 (검색 계약, 랭킹 조정, 한국어 본문 검색 한계)

Co-Authored-By: Claude Sonnet 5.5 <noreply@anthropic.com>
</commit_message>
<xml_diff>
--- a/docs-word/02-제품_요구사항_정의서.docx
+++ b/docs-word/02-제품_요구사항_정의서.docx
@@ -9180,7 +9180,7 @@
           <w:sz w:val="22"/>
           <w:lang w:eastAsia="ko-KR"/>
         </w:rPr>
-        <w:t>초기 랭킹 가중치:</w:t>
+        <w:t>초기 랭킹 가중치(v1.8에서 구현하며 조정한 값 포함 — 아래 표 아래 "구현 조정" 참고):</w:t>
       </w:r>
     </w:p>
     <w:p>
@@ -9210,7 +9210,7 @@
           <w:sz w:val="17"/>
           <w:lang w:eastAsia="ko-KR"/>
         </w:rPr>
-        <w:t>exact title                 +100</w:t>
+        <w:t>exact title                 +300  (설계 초안 +100)</w:t>
       </w:r>
       <w:r>
         <w:br/>
@@ -9223,6 +9223,18 @@
           <w:lang w:eastAsia="ko-KR"/>
         </w:rPr>
         <w:t>title prefix                 +70</w:t>
+      </w:r>
+      <w:r>
+        <w:br/>
+      </w:r>
+      <w:r>
+        <w:rPr>
+          <w:rFonts w:ascii="Menlo" w:hAnsi="Menlo" w:eastAsia="Menlo" w:cs="Menlo"/>
+          <w:color w:val="000000"/>
+          <w:sz w:val="17"/>
+          <w:lang w:eastAsia="ko-KR"/>
+        </w:rPr>
+        <w:t>title contains (추가)        +35</w:t>
       </w:r>
       <w:r>
         <w:br/>
@@ -9317,7 +9329,211 @@
           <w:sz w:val="22"/>
           <w:lang w:eastAsia="ko-KR"/>
         </w:rPr>
-        <w:t>랭킹은 SQL 상수 또는 설정 클래스로 중앙화하고 검색 회귀 테스트로 관리한다. 최신성 때문에 오래된 정확 일치가 밀리지 않도록 최신성 점수 상한을 낮게 둔다.</w:t>
+        <w:t>랭킹은 SQL 상수 또는 설정 클래스로 중앙화하고 검색 회귀 테스트로 관리한다.</w:t>
+      </w:r>
+    </w:p>
+    <w:p>
+      <w:r>
+        <w:rPr>
+          <w:rFonts w:ascii="Arial" w:hAnsi="Arial" w:eastAsia="Malgun Gothic" w:cs="Malgun Gothic"/>
+          <w:b/>
+          <w:color w:val="000000"/>
+          <w:sz w:val="22"/>
+          <w:lang w:eastAsia="ko-KR"/>
+        </w:rPr>
+        <w:t>구현 조정(v1.8, fixture에서 확인):</w:t>
+      </w:r>
+      <w:r>
+        <w:rPr>
+          <w:rFonts w:ascii="Arial" w:hAnsi="Arial" w:eastAsia="Malgun Gothic" w:cs="Malgun Gothic"/>
+          <w:color w:val="000000"/>
+          <w:sz w:val="22"/>
+          <w:lang w:eastAsia="ko-KR"/>
+        </w:rPr>
+        <w:t xml:space="preserve"> ① 정확 제목 일치를 100에서 </w:t>
+      </w:r>
+      <w:r>
+        <w:rPr>
+          <w:rFonts w:ascii="Arial" w:hAnsi="Arial" w:eastAsia="Malgun Gothic" w:cs="Malgun Gothic"/>
+          <w:b/>
+          <w:color w:val="000000"/>
+          <w:sz w:val="22"/>
+          <w:lang w:eastAsia="ko-KR"/>
+        </w:rPr>
+        <w:t>300</w:t>
+      </w:r>
+      <w:r>
+        <w:rPr>
+          <w:rFonts w:ascii="Arial" w:hAnsi="Arial" w:eastAsia="Malgun Gothic" w:cs="Malgun Gothic"/>
+          <w:color w:val="000000"/>
+          <w:sz w:val="22"/>
+          <w:lang w:eastAsia="ko-KR"/>
+        </w:rPr>
+        <w:t>으로 올렸다. 100이면 "제목 접두어 70 + 코드 일치 40 + 제목 FTS"처럼 약한 일치가 겹친 항목이 제목이 정확히 같은 항목을 앞질렀다(</w:t>
+      </w:r>
+      <w:r>
+        <w:rPr>
+          <w:rFonts w:ascii="Menlo" w:hAnsi="Menlo" w:eastAsia="Menlo" w:cs="Menlo"/>
+          <w:color w:val="000000"/>
+          <w:sz w:val="21"/>
+          <w:lang w:eastAsia="ko-KR"/>
+        </w:rPr>
+        <w:t>JWT</w:t>
+      </w:r>
+      <w:r>
+        <w:rPr>
+          <w:rFonts w:ascii="Arial" w:hAnsi="Arial" w:eastAsia="Malgun Gothic" w:cs="Malgun Gothic"/>
+          <w:color w:val="000000"/>
+          <w:sz w:val="22"/>
+          <w:lang w:eastAsia="ko-KR"/>
+        </w:rPr>
+        <w:t xml:space="preserve"> 검색에서 코드에 </w:t>
+      </w:r>
+      <w:r>
+        <w:rPr>
+          <w:rFonts w:ascii="Menlo" w:hAnsi="Menlo" w:eastAsia="Menlo" w:cs="Menlo"/>
+          <w:color w:val="000000"/>
+          <w:sz w:val="21"/>
+          <w:lang w:eastAsia="ko-KR"/>
+        </w:rPr>
+        <w:t>jwt</w:t>
+      </w:r>
+      <w:r>
+        <w:rPr>
+          <w:rFonts w:ascii="Arial" w:hAnsi="Arial" w:eastAsia="Malgun Gothic" w:cs="Malgun Gothic"/>
+          <w:color w:val="000000"/>
+          <w:sz w:val="22"/>
+          <w:lang w:eastAsia="ko-KR"/>
+        </w:rPr>
+        <w:t xml:space="preserve">가 든 Snippet이 </w:t>
+      </w:r>
+      <w:r>
+        <w:rPr>
+          <w:rFonts w:ascii="Menlo" w:hAnsi="Menlo" w:eastAsia="Menlo" w:cs="Menlo"/>
+          <w:color w:val="000000"/>
+          <w:sz w:val="21"/>
+          <w:lang w:eastAsia="ko-KR"/>
+        </w:rPr>
+        <w:t>JWT</w:t>
+      </w:r>
+      <w:r>
+        <w:rPr>
+          <w:rFonts w:ascii="Arial" w:hAnsi="Arial" w:eastAsia="Malgun Gothic" w:cs="Malgun Gothic"/>
+          <w:color w:val="000000"/>
+          <w:sz w:val="22"/>
+          <w:lang w:eastAsia="ko-KR"/>
+        </w:rPr>
+        <w:t xml:space="preserve"> Concept보다 위). 정확 일치가 나머지 모든 일치의 합(70+60+50+45+40+25=290)보다 크도록 둔다. ② 단어 중간의 부분 일치(</w:t>
+      </w:r>
+      <w:r>
+        <w:rPr>
+          <w:rFonts w:ascii="Menlo" w:hAnsi="Menlo" w:eastAsia="Menlo" w:cs="Menlo"/>
+          <w:color w:val="000000"/>
+          <w:sz w:val="21"/>
+          <w:lang w:eastAsia="ko-KR"/>
+        </w:rPr>
+        <w:t>sec</w:t>
+      </w:r>
+      <w:r>
+        <w:rPr>
+          <w:rFonts w:ascii="Arial" w:hAnsi="Arial" w:eastAsia="Malgun Gothic" w:cs="Malgun Gothic"/>
+          <w:color w:val="000000"/>
+          <w:sz w:val="22"/>
+          <w:lang w:eastAsia="ko-KR"/>
+        </w:rPr>
+        <w:t xml:space="preserve"> → </w:t>
+      </w:r>
+      <w:r>
+        <w:rPr>
+          <w:rFonts w:ascii="Menlo" w:hAnsi="Menlo" w:eastAsia="Menlo" w:cs="Menlo"/>
+          <w:color w:val="000000"/>
+          <w:sz w:val="21"/>
+          <w:lang w:eastAsia="ko-KR"/>
+        </w:rPr>
+        <w:t>Spring Security</w:t>
+      </w:r>
+      <w:r>
+        <w:rPr>
+          <w:rFonts w:ascii="Arial" w:hAnsi="Arial" w:eastAsia="Malgun Gothic" w:cs="Malgun Gothic"/>
+          <w:color w:val="000000"/>
+          <w:sz w:val="22"/>
+          <w:lang w:eastAsia="ko-KR"/>
+        </w:rPr>
+        <w:t xml:space="preserve">)를 위해 </w:t>
+      </w:r>
+      <w:r>
+        <w:rPr>
+          <w:rFonts w:ascii="Arial" w:hAnsi="Arial" w:eastAsia="Malgun Gothic" w:cs="Malgun Gothic"/>
+          <w:b/>
+          <w:color w:val="000000"/>
+          <w:sz w:val="22"/>
+          <w:lang w:eastAsia="ko-KR"/>
+        </w:rPr>
+        <w:t>제목 부분 일치 +35</w:t>
+      </w:r>
+      <w:r>
+        <w:rPr>
+          <w:rFonts w:ascii="Arial" w:hAnsi="Arial" w:eastAsia="Malgun Gothic" w:cs="Malgun Gothic"/>
+          <w:color w:val="000000"/>
+          <w:sz w:val="22"/>
+          <w:lang w:eastAsia="ko-KR"/>
+        </w:rPr>
+        <w:t xml:space="preserve">를 추가했다(접두어보다 낮게). ③ 정확/접두어/부분 일치는 가장 높은 하나만 적용한다(누적하지 않음). ④ 최신성은 연속 감쇠가 아니라 </w:t>
+      </w:r>
+      <w:r>
+        <w:rPr>
+          <w:rFonts w:ascii="Arial" w:hAnsi="Arial" w:eastAsia="Malgun Gothic" w:cs="Malgun Gothic"/>
+          <w:b/>
+          <w:color w:val="000000"/>
+          <w:sz w:val="22"/>
+          <w:lang w:eastAsia="ko-KR"/>
+        </w:rPr>
+        <w:t>하루 단위 계단식</w:t>
+      </w:r>
+      <w:r>
+        <w:rPr>
+          <w:rFonts w:ascii="Arial" w:hAnsi="Arial" w:eastAsia="Malgun Gothic" w:cs="Malgun Gothic"/>
+          <w:color w:val="000000"/>
+          <w:sz w:val="22"/>
+          <w:lang w:eastAsia="ko-KR"/>
+        </w:rPr>
+        <w:t xml:space="preserve">으로 둔다 — 연속이면 페이지를 넘기는 사이 </w:t>
+      </w:r>
+      <w:r>
+        <w:rPr>
+          <w:rFonts w:ascii="Menlo" w:hAnsi="Menlo" w:eastAsia="Menlo" w:cs="Menlo"/>
+          <w:color w:val="000000"/>
+          <w:sz w:val="21"/>
+          <w:lang w:eastAsia="ko-KR"/>
+        </w:rPr>
+        <w:t>now()</w:t>
+      </w:r>
+      <w:r>
+        <w:rPr>
+          <w:rFonts w:ascii="Arial" w:hAnsi="Arial" w:eastAsia="Malgun Gothic" w:cs="Malgun Gothic"/>
+          <w:color w:val="000000"/>
+          <w:sz w:val="22"/>
+          <w:lang w:eastAsia="ko-KR"/>
+        </w:rPr>
+        <w:t xml:space="preserve">가 바뀌어 </w:t>
+      </w:r>
+      <w:r>
+        <w:rPr>
+          <w:rFonts w:ascii="Menlo" w:hAnsi="Menlo" w:eastAsia="Menlo" w:cs="Menlo"/>
+          <w:color w:val="000000"/>
+          <w:sz w:val="21"/>
+          <w:lang w:eastAsia="ko-KR"/>
+        </w:rPr>
+        <w:t>score_key</w:t>
+      </w:r>
+      <w:r>
+        <w:rPr>
+          <w:rFonts w:ascii="Arial" w:hAnsi="Arial" w:eastAsia="Malgun Gothic" w:cs="Malgun Gothic"/>
+          <w:color w:val="000000"/>
+          <w:sz w:val="22"/>
+          <w:lang w:eastAsia="ko-KR"/>
+        </w:rPr>
+        <w:t>가 흔들려 cursor가 어긋난다. ⑤ 코드 점수는 부분 문자열 일치를 similarity 1.0으로 본다(대소문자 무시). 대용량 코드에서 행마다 trigram 유사도를 계산하는 비용을 피하기 위한 단순화이며, 유사도 계산은 0건 fallback에서만 쓴다. 최신성 때문에 오래된 정확 일치가 밀리지 않도록 최신성 점수 상한을 낮게 둔다.</w:t>
       </w:r>
     </w:p>
     <w:p>

</xml_diff>